<commit_message>
docs: clone-and-run setup instructions for reviewers
README: prominent Getting started section with git clone URL, Docker
(one command) and local (Go 1.25 + Node 20) paths, healthcheck, and
optional AI/browser steps; removed duplicate quick-start sections and
corrected the Go version. Lithuanian .docx: added 'Projekto atsisiuntimas
(git clone)' section and renumbered. Verified by a fresh clone that
backend (go build) and frontend (npm build) compile cleanly.
</commit_message>
<xml_diff>
--- a/docs/Ergonix_diegimo_instrukcija.docx
+++ b/docs/Ergonix_diegimo_instrukcija.docx
@@ -564,7 +564,7 @@
           <w:sz w:val="30"/>
           <w:szCs w:val="30"/>
         </w:rPr>
-        <w:t xml:space="preserve">3. Greitas paleidimas su Docker</w:t>
+        <w:t xml:space="preserve">3. Projekto atsisiuntimas (git clone)</w:t>
       </w:r>
     </w:p>
     <w:p>
@@ -578,7 +578,90 @@
           <w:sz w:val="21"/>
           <w:szCs w:val="21"/>
         </w:rPr>
-        <w:t xml:space="preserve">Tai rekomenduojamas būdas – visos dalys paleidžiamos viena komanda.</w:t>
+        <w:t xml:space="preserve">Pirmiausia parsisiųskite projektą iš GitHub ir įeikite į katalogą:</w:t>
+      </w:r>
+    </w:p>
+    <w:p>
+      <w:pPr>
+        <w:pBdr>
+          <w:top w:val="single" w:color="E4E7EC" w:sz="4" w:space="2"/>
+          <w:left w:val="single" w:color="0D9488" w:sz="18" w:space="6"/>
+        </w:pBdr>
+        <w:shd w:fill="F2F4F7" w:color="auto" w:val="clear"/>
+        <w:spacing w:after="0" w:line="250"/>
+      </w:pPr>
+      <w:r>
+        <w:rPr>
+          <w:rFonts w:ascii="Consolas" w:cs="Consolas" w:eastAsia="Consolas" w:hAnsi="Consolas"/>
+          <w:color w:val="1A2537"/>
+          <w:sz w:val="18"/>
+          <w:szCs w:val="18"/>
+        </w:rPr>
+        <w:t xml:space="preserve">git clone https://github.com/Dason222/ergonix-audit-platform.git</w:t>
+      </w:r>
+    </w:p>
+    <w:p>
+      <w:pPr>
+        <w:pBdr>
+          <w:bottom w:val="single" w:color="E4E7EC" w:sz="4" w:space="2"/>
+          <w:left w:val="single" w:color="0D9488" w:sz="18" w:space="6"/>
+        </w:pBdr>
+        <w:shd w:fill="F2F4F7" w:color="auto" w:val="clear"/>
+        <w:spacing w:after="140" w:line="250"/>
+      </w:pPr>
+      <w:r>
+        <w:rPr>
+          <w:rFonts w:ascii="Consolas" w:cs="Consolas" w:eastAsia="Consolas" w:hAnsi="Consolas"/>
+          <w:color w:val="1A2537"/>
+          <w:sz w:val="18"/>
+          <w:szCs w:val="18"/>
+        </w:rPr>
+        <w:t xml:space="preserve">cd ergonix-audit-platform</w:t>
+      </w:r>
+    </w:p>
+    <w:p>
+      <w:pPr>
+        <w:spacing w:after="120" w:line="276"/>
+      </w:pPr>
+      <w:r>
+        <w:rPr>
+          <w:rFonts w:ascii="Calibri" w:cs="Calibri" w:eastAsia="Calibri" w:hAnsi="Calibri"/>
+          <w:color w:val="222222"/>
+          <w:sz w:val="21"/>
+          <w:szCs w:val="21"/>
+        </w:rPr>
+        <w:t xml:space="preserve">Toliau projektą galima paleisti dviem būdais: su Docker (paprasčiausia, 4 skyrius) arba lokaliai (5 skyrius). Jokios papildomos konfigūracijos pradžiai nereikia – programa veikia su numatytosiomis reikšmėmis, o DI analizė lieka išjungta, kol neįvedamas API raktas.</w:t>
+      </w:r>
+    </w:p>
+    <w:p>
+      <w:pPr>
+        <w:pStyle w:val="Heading1"/>
+        <w:spacing w:after="140" w:before="320"/>
+      </w:pPr>
+      <w:r>
+        <w:rPr>
+          <w:rFonts w:ascii="Calibri" w:cs="Calibri" w:eastAsia="Calibri" w:hAnsi="Calibri"/>
+          <w:b/>
+          <w:bCs/>
+          <w:color w:val="1A2537"/>
+          <w:sz w:val="30"/>
+          <w:szCs w:val="30"/>
+        </w:rPr>
+        <w:t xml:space="preserve">4. Greitas paleidimas su Docker</w:t>
+      </w:r>
+    </w:p>
+    <w:p>
+      <w:pPr>
+        <w:spacing w:after="120" w:line="276"/>
+      </w:pPr>
+      <w:r>
+        <w:rPr>
+          <w:rFonts w:ascii="Calibri" w:cs="Calibri" w:eastAsia="Calibri" w:hAnsi="Calibri"/>
+          <w:color w:val="222222"/>
+          <w:sz w:val="21"/>
+          <w:szCs w:val="21"/>
+        </w:rPr>
+        <w:t xml:space="preserve">Tai rekomenduojamas būdas – reikia tik Docker; visos dalys paleidžiamos viena komanda.</w:t>
       </w:r>
     </w:p>
     <w:p>
@@ -818,7 +901,7 @@
           <w:sz w:val="30"/>
           <w:szCs w:val="30"/>
         </w:rPr>
-        <w:t xml:space="preserve">4. Paleidimas lokaliai (be Docker)</w:t>
+        <w:t xml:space="preserve">5. Paleidimas lokaliai (be Docker)</w:t>
       </w:r>
     </w:p>
     <w:p>
@@ -832,7 +915,7 @@
           <w:sz w:val="21"/>
           <w:szCs w:val="21"/>
         </w:rPr>
-        <w:t xml:space="preserve">Reikės dviejų terminalų – atskirai serveriui ir sąsajai.</w:t>
+        <w:t xml:space="preserve">Reikės dviejų terminalų – atskirai serveriui ir sąsajai. Būtina: Go ≥ 1.25 ir Node.js ≥ 20.</w:t>
       </w:r>
     </w:p>
     <w:p>
@@ -849,7 +932,7 @@
           <w:sz w:val="25"/>
           <w:szCs w:val="25"/>
         </w:rPr>
-        <w:t xml:space="preserve">4.1. Serveris (portas 8080)</w:t>
+        <w:t xml:space="preserve">5.1. Serveris (portas 8080)</w:t>
       </w:r>
     </w:p>
     <w:p>
@@ -904,7 +987,7 @@
           <w:sz w:val="25"/>
           <w:szCs w:val="25"/>
         </w:rPr>
-        <w:t xml:space="preserve">4.2. Naršyklės sąsaja (portas 5173)</w:t>
+        <w:t xml:space="preserve">5.2. Naršyklės sąsaja (portas 5173)</w:t>
       </w:r>
     </w:p>
     <w:p>
@@ -995,6 +1078,56 @@
           <w:szCs w:val="21"/>
         </w:rPr>
         <w:t xml:space="preserve">. Vite serveris automatiškai persiunčia „/api“ užklausas į serverį (:8080).</w:t>
+      </w:r>
+    </w:p>
+    <w:p>
+      <w:pPr>
+        <w:spacing w:after="120" w:line="276"/>
+      </w:pPr>
+      <w:r>
+        <w:rPr>
+          <w:rFonts w:ascii="Calibri" w:cs="Calibri" w:eastAsia="Calibri" w:hAnsi="Calibri"/>
+          <w:color w:val="222222"/>
+          <w:sz w:val="21"/>
+          <w:szCs w:val="21"/>
+        </w:rPr>
+        <w:t xml:space="preserve">Ar serveris veikia, galima patikrinti: </w:t>
+      </w:r>
+      <w:r>
+        <w:rPr>
+          <w:rFonts w:ascii="Consolas" w:cs="Consolas" w:eastAsia="Consolas" w:hAnsi="Consolas"/>
+          <w:color w:val="B4232B"/>
+          <w:sz w:val="19"/>
+          <w:szCs w:val="19"/>
+        </w:rPr>
+        <w:t xml:space="preserve">curl http://localhost:8080/healthz</w:t>
+      </w:r>
+      <w:r>
+        <w:rPr>
+          <w:rFonts w:ascii="Calibri" w:cs="Calibri" w:eastAsia="Calibri" w:hAnsi="Calibri"/>
+          <w:color w:val="222222"/>
+          <w:sz w:val="21"/>
+          <w:szCs w:val="21"/>
+        </w:rPr>
+        <w:t xml:space="preserve"> turi grąžinti </w:t>
+      </w:r>
+      <w:r>
+        <w:rPr>
+          <w:rFonts w:ascii="Consolas" w:cs="Consolas" w:eastAsia="Consolas" w:hAnsi="Consolas"/>
+          <w:color w:val="B4232B"/>
+          <w:sz w:val="19"/>
+          <w:szCs w:val="19"/>
+        </w:rPr>
+        <w:t xml:space="preserve">{"status":"ok"}</w:t>
+      </w:r>
+      <w:r>
+        <w:rPr>
+          <w:rFonts w:ascii="Calibri" w:cs="Calibri" w:eastAsia="Calibri" w:hAnsi="Calibri"/>
+          <w:color w:val="222222"/>
+          <w:sz w:val="21"/>
+          <w:szCs w:val="21"/>
+        </w:rPr>
+        <w:t xml:space="preserve">.</w:t>
       </w:r>
     </w:p>
     <w:p>
@@ -1011,7 +1144,7 @@
           <w:sz w:val="25"/>
           <w:szCs w:val="25"/>
         </w:rPr>
-        <w:t xml:space="preserve">4.3. Testai (neprivaloma)</w:t>
+        <w:t xml:space="preserve">5.3. Testai (neprivaloma)</w:t>
       </w:r>
     </w:p>
     <w:p>
@@ -1066,7 +1199,7 @@
           <w:sz w:val="30"/>
           <w:szCs w:val="30"/>
         </w:rPr>
-        <w:t xml:space="preserve">5. Automatinis auditas iš komandinės eilutės</w:t>
+        <w:t xml:space="preserve">6. Automatinis auditas iš komandinės eilutės</w:t>
       </w:r>
     </w:p>
     <w:p>
@@ -1385,7 +1518,7 @@
           <w:sz w:val="30"/>
           <w:szCs w:val="30"/>
         </w:rPr>
-        <w:t xml:space="preserve">6. Konfigūracija (.env)</w:t>
+        <w:t xml:space="preserve">7. Konfigūracija (.env)</w:t>
       </w:r>
     </w:p>
     <w:p>
@@ -2241,7 +2374,7 @@
           <w:sz w:val="30"/>
           <w:szCs w:val="30"/>
         </w:rPr>
-        <w:t xml:space="preserve">7. Nustatymai per naršyklę</w:t>
+        <w:t xml:space="preserve">8. Nustatymai per naršyklę</w:t>
       </w:r>
     </w:p>
     <w:p>
@@ -2292,7 +2425,7 @@
           <w:sz w:val="25"/>
           <w:szCs w:val="25"/>
         </w:rPr>
-        <w:t xml:space="preserve">7.1. Dirbtinio intelekto analizė</w:t>
+        <w:t xml:space="preserve">8.1. Dirbtinio intelekto analizė</w:t>
       </w:r>
     </w:p>
     <w:p>
@@ -2402,7 +2535,7 @@
           <w:sz w:val="25"/>
           <w:szCs w:val="25"/>
         </w:rPr>
-        <w:t xml:space="preserve">7.2. Automatinis auditas (tvarkaraštis)</w:t>
+        <w:t xml:space="preserve">8.2. Automatinis auditas (tvarkaraštis)</w:t>
       </w:r>
     </w:p>
     <w:p>
@@ -2490,7 +2623,7 @@
           <w:sz w:val="30"/>
           <w:szCs w:val="30"/>
         </w:rPr>
-        <w:t xml:space="preserve">8. Diegimas serveryje (deploy)</w:t>
+        <w:t xml:space="preserve">9. Diegimas serveryje (deploy)</w:t>
       </w:r>
     </w:p>
     <w:p>
@@ -2507,7 +2640,7 @@
           <w:sz w:val="25"/>
           <w:szCs w:val="25"/>
         </w:rPr>
-        <w:t xml:space="preserve">8.1. Variantas A – Docker Compose (rekomenduojama)</w:t>
+        <w:t xml:space="preserve">9.1. Variantas A – Docker Compose (rekomenduojama)</w:t>
       </w:r>
     </w:p>
     <w:p>
@@ -2672,7 +2805,7 @@
           <w:sz w:val="25"/>
           <w:szCs w:val="25"/>
         </w:rPr>
-        <w:t xml:space="preserve">8.2. Variantas B – be Docker (systemd)</w:t>
+        <w:t xml:space="preserve">9.2. Variantas B – be Docker (systemd)</w:t>
       </w:r>
     </w:p>
     <w:p>
@@ -3126,7 +3259,7 @@
           <w:sz w:val="30"/>
           <w:szCs w:val="30"/>
         </w:rPr>
-        <w:t xml:space="preserve">9. Dažnos problemos ir sprendimai</w:t>
+        <w:t xml:space="preserve">10. Dažnos problemos ir sprendimai</w:t>
       </w:r>
     </w:p>
     <w:p>
@@ -3428,7 +3561,7 @@
           <w:sz w:val="30"/>
           <w:szCs w:val="30"/>
         </w:rPr>
-        <w:t xml:space="preserve">10. Papildoma informacija</w:t>
+        <w:t xml:space="preserve">11. Papildoma informacija</w:t>
       </w:r>
     </w:p>
     <w:p>

</xml_diff>